<commit_message>
feat(dao): « oui a tout » — les six decisions portees, codes N3 arretes, modeles regeneres
Decisions du pilote du 26/09 : B02-OB-03 obligatoire ; B03-CQ-01 ouvert aux trois
categories ; A1-A4 une fois par dossier, C1/C2 par lot ; rendu (c) par le moteur du backend
depuis les fichiers de commande versionnes, PDF joints au dossier ; S6 absent ; 105 saisi et
« trentieme (30eme) » derive.

Les codes des deux durees d'antecedents sont arretes — B03-CQ-09 (juridiques, defaut 5) et
B03-CQ-10 (financiers, defaut 3), rubrique existante, attribut valeurDefaut — et portes dans
le descripteur : fichiers de commande, descripteurs et .docx regeneres, les six toujours
identiques au dossier au caractere pres.

Le README de relecture ouvre sur les decisions, ses tableaux sont regeneres ; le plan et la
demande §B8 portent l'arbitrage en encadre date. Le chantier backend est ouvert.

Co-Authored-By: Claude Fable 5.1 <noreply@anthropic.com>
</commit_message>
<xml_diff>
--- a/docs/modeles-candidat/A1.docx
+++ b/docs/modeles-candidat/A1.docx
@@ -207,7 +207,7 @@
           <w:b w:val="off"/>
           <w:sz w:val="22"/>
         </w:rPr>
-        <w:t>Description de procédure de redressement judiciaire ou équivalent au cours des {{B03-AJ-01.lettres}} dernières années et situation actuelle, incluant situation active et passive :</w:t>
+        <w:t>Description de procédure de redressement judiciaire ou équivalent au cours des {{B03-CQ-09.lettres}} dernières années et situation actuelle, incluant situation active et passive :</w:t>
       </w:r>
     </w:p>
     <w:p/>
@@ -534,33 +534,33 @@
           <w:b w:val="off"/>
           <w:sz w:val="22"/>
         </w:rPr>
-        <w:t>Marchés non exécutés au cours des {{B03-AJ-01.lettres}} dernières années</w:t>
-      </w:r>
-    </w:p>
-    <w:p>
-      <w:pPr>
-        <w:spacing w:after="120"/>
-        <w:jc w:val="both"/>
-      </w:pPr>
-      <w:r>
-        <w:rPr>
-          <w:b w:val="off"/>
-          <w:sz w:val="22"/>
-        </w:rPr>
-        <w:t>Il n’y a pas eu de non-exécution de marché pendant la période de {{B03-AJ-01}} ans</w:t>
-      </w:r>
-    </w:p>
-    <w:p>
-      <w:pPr>
-        <w:spacing w:after="120"/>
-        <w:jc w:val="both"/>
-      </w:pPr>
-      <w:r>
-        <w:rPr>
-          <w:b w:val="off"/>
-          <w:sz w:val="22"/>
-        </w:rPr>
-        <w:t>Marché(s) non exécuté(s) pendant la période de {{B03-AJ-01}} années.</w:t>
+        <w:t>Marchés non exécutés au cours des {{B03-CQ-09.lettres}} dernières années</w:t>
+      </w:r>
+    </w:p>
+    <w:p>
+      <w:pPr>
+        <w:spacing w:after="120"/>
+        <w:jc w:val="both"/>
+      </w:pPr>
+      <w:r>
+        <w:rPr>
+          <w:b w:val="off"/>
+          <w:sz w:val="22"/>
+        </w:rPr>
+        <w:t>Il n’y a pas eu de non-exécution de marché pendant la période de {{B03-CQ-09}} ans</w:t>
+      </w:r>
+    </w:p>
+    <w:p>
+      <w:pPr>
+        <w:spacing w:after="120"/>
+        <w:jc w:val="both"/>
+      </w:pPr>
+      <w:r>
+        <w:rPr>
+          <w:b w:val="off"/>
+          <w:sz w:val="22"/>
+        </w:rPr>
+        <w:t>Marché(s) non exécuté(s) pendant la période de {{B03-CQ-09}} années.</w:t>
       </w:r>
     </w:p>
     <w:tbl>
@@ -711,7 +711,7 @@
           <w:b w:val="off"/>
           <w:sz w:val="22"/>
         </w:rPr>
-        <w:t>Litiges au cours des {{B03-AJ-01.lettres}} dernières années</w:t>
+        <w:t>Litiges au cours des {{B03-CQ-09.lettres}} dernières années</w:t>
       </w:r>
     </w:p>
     <w:p>

</xml_diff>